<commit_message>
Updated details based on books
</commit_message>
<xml_diff>
--- a/Campaign Setting.docx
+++ b/Campaign Setting.docx
@@ -6580,6 +6580,80 @@
       </w:r>
     </w:p>
     <w:p/>
+    <w:p/>
+    <w:p>
+      <w:pPr>
+        <w:pStyle w:val="Heading1"/>
+      </w:pPr>
+      <w:r>
+        <w:t>9. Authentic Canonical Lore &amp; Expanded Setting Details</w:t>
+      </w:r>
+    </w:p>
+    <w:p>
+      <w:pPr>
+        <w:pStyle w:val="Heading2"/>
+      </w:pPr>
+      <w:r>
+        <w:t>9.1 Zingara with its Chivalry (The Howardian Ethos)</w:t>
+      </w:r>
+    </w:p>
+    <w:p>
+      <w:r>
+        <w:t>In Robert E. Howard's 'The Phoenix on the Sword' (1932), the Nemedian Chronicles excerpt famously designates the realm: '...Zingara with its chivalry...' This defines the cultural heart of the kingdom. High chivalric orders—such as the Order of the Golden Bull, the Knights of Saint Ancillus, and the Order of the Black Rose—maintain tournaments, coats-of-arms, and romantic chivalric punctilio in the Vega of Kordava. Caballeros wear rich velvet and silk doublets over polished, fluted steel cuirasses, and will duel to the death over matters of pundonor.</w:t>
+      </w:r>
+    </w:p>
+    <w:p>
+      <w:pPr>
+        <w:pStyle w:val="Heading2"/>
+      </w:pPr>
+      <w:r>
+        <w:t>9.2 Castle Valbroso &amp; The Haunted Southern Border Forest</w:t>
+      </w:r>
+    </w:p>
+    <w:p>
+      <w:r>
+        <w:t>Chronicled in Chapters 12 and 13 of Howard's 'The Hour of the Dragon', Castle Valbroso guards the lone carriage road linking Poitain, mainland Zingara, and the Argossean port of Messantia. South of the fortress lies a vast, primeval wilderness—the haunted border forest—infested with ravenous ghouls and maneaters, navigable only via secret trails mapped by border scouts like Beloso.</w:t>
+      </w:r>
+    </w:p>
+    <w:p>
+      <w:pPr>
+        <w:pStyle w:val="Heading2"/>
+      </w:pPr>
+      <w:r>
+        <w:t>9.3 The Fief of Korzetta &amp; The Lost Treasure of Tranicos</w:t>
+      </w:r>
+    </w:p>
+    <w:p>
+      <w:r>
+        <w:t>From 'The Black Stranger' / 'The Treasure of Tranicos', the County of Korzetta sits along the western bluffs, rich in olive groves and natural coves. Its lord, Count Valenso, fled to the Pictish coast to escape the demonic Black Stranger, leaving the fief contested. Meanwhile, corsairs and nobles obsessively hunt the lost mountain hoard of Bloody Tranicos, preserved in a death-banquet cavern guarded by supernatural mist.</w:t>
+      </w:r>
+    </w:p>
+    <w:p>
+      <w:pPr>
+        <w:pStyle w:val="Heading2"/>
+      </w:pPr>
+      <w:r>
+        <w:t>9.4 Kordava Built Upon Ancient Ruins &amp; The White Rose</w:t>
+      </w:r>
+    </w:p>
+    <w:p>
+      <w:r>
+        <w:t>From Karl Edward Wagner's 'Conan: The Road of Kings', modern Kordava sits directly atop an ancient, earthquake-shattered metropolis. In the subterranean depths of The Pit, the Rebels of the White Rose (Santiddio, Sandokazi, Mordermi) plot the downfall of tyrant kings, while ancient Acheronian crypts house the indestructible stone Final Guard of King Kalenius.</w:t>
+      </w:r>
+    </w:p>
+    <w:p>
+      <w:pPr>
+        <w:pStyle w:val="Heading2"/>
+      </w:pPr>
+      <w:r>
+        <w:t>9.5 Dynastic Kings: King Rimanendo, King Ferdrugo, &amp; Duke Villagro</w:t>
+      </w:r>
+    </w:p>
+    <w:p>
+      <w:r>
+        <w:t>The historical chronology includes the despotic reign of King Rimanendo (Wagner's 'The Road of Kings'), whose tyranny provoked the rise of the White Rose in The Pit, and the ailing reign of King Ferdrugo (de Camp &amp; Carter's 'Conan the Buccaneer'), whose cousin Duke Villagro conspired with sorcerers to usurp the crown, establishing the precedent for shadowy puppetmasters ruling behind the throne.</w:t>
+      </w:r>
+    </w:p>
     <w:sectPr>
       <w:pgSz w:w="11906" w:h="16838"/>
       <w:pgMar w:top="1440" w:right="1440" w:bottom="1440" w:left="1440" w:header="708" w:footer="708" w:gutter="0"/>

</xml_diff>